<commit_message>
Added new updates to the interface
</commit_message>
<xml_diff>
--- a/backend/controllers/output_3.docx
+++ b/backend/controllers/output_3.docx
@@ -39,7 +39,7 @@
           <w:bCs/>
           <w:lang w:val="en-US"/>
         </w:rPr>
-        <w:t xml:space="preserve">CSE316:</w:t>
+        <w:t xml:space="preserve">CSE372:</w:t>
       </w:r>
       <w:r>
         <w:rPr>
@@ -57,7 +57,7 @@
           <w:bCs/>
           <w:lang w:val="en-US"/>
         </w:rPr>
-        <w:t xml:space="preserve">Operating System </w:t>
+        <w:t xml:space="preserve">UI UX Design</w:t>
       </w:r>
     </w:p>
     <w:p>
@@ -260,7 +260,7 @@
           <w:rStyle w:val="markedcontent"/>
           <w:rFonts w:ascii="Times New Roman" w:hAnsi="Times New Roman" w:cs="Times New Roman"/>
         </w:rPr>
-        <w:t xml:space="preserve"> What is UI?</w:t>
+        <w:t xml:space="preserve"> What is lifeee?</w:t>
       </w:r>
       <w:r>
         <w:rPr>
@@ -321,142 +321,6 @@
           <w:rFonts w:ascii="Times New Roman" w:hAnsi="Times New Roman" w:cs="Times New Roman"/>
         </w:rPr>
         <w:t/>
-      </w:r>
-      <w:r>
-        <w:rPr>
-          <w:rStyle w:val="hljs-selector-id"/>
-          <w:rFonts w:ascii="Times New Roman" w:hAnsi="Times New Roman" w:cs="Times New Roman"/>
-        </w:rPr>
-        <w:t/>
-      </w:r>
-      <w:r>
-        <w:rPr>
-          <w:rFonts w:ascii="Times New Roman" w:hAnsi="Times New Roman" w:cs="Times New Roman"/>
-        </w:rPr>
-        <w:t/>
-      </w:r>
-    </w:p>
-    <w:p>
-      <w:pPr>
-        <w:spacing w:after="0" w:line="240" w:lineRule="auto"/>
-        <w:rPr>
-          <w:rFonts w:ascii="Times New Roman" w:hAnsi="Times New Roman" w:cs="Times New Roman"/>
-          <w:lang w:val="en-US"/>
-        </w:rPr>
-      </w:pPr>
-      <w:r>
-        <w:rPr>
-          <w:rFonts w:ascii="Times New Roman" w:hAnsi="Times New Roman" w:cs="Times New Roman"/>
-        </w:rPr>
-        <w:t xml:space="preserve">    </w:t>
-      </w:r>
-      <w:r>
-        <w:rPr>
-          <w:rFonts w:ascii="Times New Roman" w:hAnsi="Times New Roman" w:cs="Times New Roman"/>
-        </w:rPr>
-        <w:t xml:space="preserve">A. A software</w:t>
-      </w:r>
-      <w:r>
-        <w:rPr>
-          <w:rStyle w:val="hljs-selector-id"/>
-          <w:rFonts w:ascii="Times New Roman" w:hAnsi="Times New Roman" w:cs="Times New Roman"/>
-        </w:rPr>
-        <w:t/>
-      </w:r>
-      <w:r>
-        <w:rPr>
-          <w:rFonts w:ascii="Times New Roman" w:hAnsi="Times New Roman" w:cs="Times New Roman"/>
-        </w:rPr>
-        <w:t/>
-      </w:r>
-    </w:p>
-    <w:p>
-      <w:pPr>
-        <w:spacing w:after="0" w:line="240" w:lineRule="auto"/>
-        <w:rPr>
-          <w:rFonts w:ascii="Times New Roman" w:hAnsi="Times New Roman" w:cs="Times New Roman"/>
-          <w:lang w:val="en-US"/>
-        </w:rPr>
-      </w:pPr>
-      <w:r>
-        <w:rPr>
-          <w:rFonts w:ascii="Times New Roman" w:hAnsi="Times New Roman" w:cs="Times New Roman"/>
-        </w:rPr>
-        <w:t xml:space="preserve">    </w:t>
-      </w:r>
-      <w:r>
-        <w:rPr>
-          <w:rFonts w:ascii="Times New Roman" w:hAnsi="Times New Roman" w:cs="Times New Roman"/>
-        </w:rPr>
-        <w:t xml:space="preserve">B. A hardware</w:t>
-      </w:r>
-      <w:r>
-        <w:rPr>
-          <w:rStyle w:val="hljs-selector-id"/>
-          <w:rFonts w:ascii="Times New Roman" w:hAnsi="Times New Roman" w:cs="Times New Roman"/>
-        </w:rPr>
-        <w:t/>
-      </w:r>
-      <w:r>
-        <w:rPr>
-          <w:rFonts w:ascii="Times New Roman" w:hAnsi="Times New Roman" w:cs="Times New Roman"/>
-        </w:rPr>
-        <w:t/>
-      </w:r>
-    </w:p>
-    <w:p>
-      <w:pPr>
-        <w:spacing w:after="0" w:line="240" w:lineRule="auto"/>
-        <w:rPr>
-          <w:rFonts w:ascii="Times New Roman" w:hAnsi="Times New Roman" w:cs="Times New Roman"/>
-          <w:lang w:val="en-US"/>
-        </w:rPr>
-      </w:pPr>
-      <w:r>
-        <w:rPr>
-          <w:rFonts w:ascii="Times New Roman" w:hAnsi="Times New Roman" w:cs="Times New Roman"/>
-        </w:rPr>
-        <w:t xml:space="preserve">    </w:t>
-      </w:r>
-      <w:r>
-        <w:rPr>
-          <w:rFonts w:ascii="Times New Roman" w:hAnsi="Times New Roman" w:cs="Times New Roman"/>
-        </w:rPr>
-        <w:t xml:space="preserve">C. I don't know</w:t>
-      </w:r>
-      <w:r>
-        <w:rPr>
-          <w:rStyle w:val="hljs-selector-id"/>
-          <w:rFonts w:ascii="Times New Roman" w:hAnsi="Times New Roman" w:cs="Times New Roman"/>
-        </w:rPr>
-        <w:t/>
-      </w:r>
-      <w:r>
-        <w:rPr>
-          <w:rFonts w:ascii="Times New Roman" w:hAnsi="Times New Roman" w:cs="Times New Roman"/>
-        </w:rPr>
-        <w:t/>
-      </w:r>
-    </w:p>
-    <w:p>
-      <w:pPr>
-        <w:spacing w:after="0" w:line="240" w:lineRule="auto"/>
-        <w:rPr>
-          <w:rFonts w:ascii="Times New Roman" w:hAnsi="Times New Roman" w:cs="Times New Roman"/>
-          <w:lang w:val="en-US"/>
-        </w:rPr>
-      </w:pPr>
-      <w:r>
-        <w:rPr>
-          <w:rFonts w:ascii="Times New Roman" w:hAnsi="Times New Roman" w:cs="Times New Roman"/>
-        </w:rPr>
-        <w:t xml:space="preserve">    </w:t>
-      </w:r>
-      <w:r>
-        <w:rPr>
-          <w:rFonts w:ascii="Times New Roman" w:hAnsi="Times New Roman" w:cs="Times New Roman"/>
-        </w:rPr>
-        <w:t xml:space="preserve">D. I don't care</w:t>
       </w:r>
     </w:p>
     <w:p>

</xml_diff>

<commit_message>
Added Notifications system in faculty dashboard
</commit_message>
<xml_diff>
--- a/backend/controllers/output_3.docx
+++ b/backend/controllers/output_3.docx
@@ -59,7 +59,7 @@
           <w:bCs/>
           <w:lang w:val="en-US"/>
         </w:rPr>
-        <w:t xml:space="preserve">CSE531</w:t>
+        <w:t xml:space="preserve">CSE372</w:t>
       </w:r>
       <w:proofErr w:type="spellStart"/>
       <w:r>
@@ -97,7 +97,7 @@
           <w:bCs/>
           <w:lang w:val="en-US"/>
         </w:rPr>
-        <w:t xml:space="preserve">Machine Learning</w:t>
+        <w:t xml:space="preserve">UI UX Design</w:t>
       </w:r>
       <w:proofErr w:type="spellStart"/>
       <w:r>
@@ -1192,7 +1192,7 @@
           <w:rStyle w:val="markedcontent"/>
           <w:rFonts w:ascii="Times New Roman" w:hAnsi="Times New Roman" w:cs="Times New Roman"/>
         </w:rPr>
-        <w:t xml:space="preserve"> What is UI UX?</w:t>
+        <w:t xml:space="preserve"> What am I doing at this point?</w:t>
       </w:r>
     </w:p>
     <w:p>
@@ -1208,54 +1208,6 @@
           <w:rStyle w:val="markedcontent"/>
           <w:rFonts w:ascii="Times New Roman" w:hAnsi="Times New Roman" w:cs="Times New Roman"/>
         </w:rPr>
-        <w:drawing>
-          <wp:inline distT="0" distB="0" distL="0" distR="0">
-            <wp:extent cx="1428750" cy="1428750"/>
-            <wp:effectExtent l="0" t="0" r="0" b="0"/>
-            <wp:docPr id="2" name="Image 2" descr="image"/>
-            <wp:cNvGraphicFramePr>
-              <a:graphicFrameLocks xmlns:a="http://schemas.openxmlformats.org/drawingml/2006/main" noChangeAspect="1"/>
-            </wp:cNvGraphicFramePr>
-            <a:graphic xmlns:a="http://schemas.openxmlformats.org/drawingml/2006/main">
-              <a:graphicData uri="http://schemas.openxmlformats.org/drawingml/2006/picture">
-                <pic:pic xmlns:pic="http://schemas.openxmlformats.org/drawingml/2006/picture">
-                  <pic:nvPicPr>
-                    <pic:cNvPr id="0" name="Picture 1" descr="image"/>
-                    <pic:cNvPicPr>
-                      <a:picLocks noChangeAspect="1" noChangeArrowheads="1"/>
-                    </pic:cNvPicPr>
-                  </pic:nvPicPr>
-                  <pic:blipFill>
-                    <a:blip r:embed="rId7">
-                      <a:extLst>
-                        <a:ext uri="{28A0092B-C50C-407E-A947-70E740481C1C}">
-                          <a14:useLocalDpi xmlns:a14="http://schemas.microsoft.com/office/drawing/2010/main" val="0"/>
-                        </a:ext>
-                      </a:extLst>
-                    </a:blip>
-                    <a:srcRect/>
-                    <a:stretch>
-                      <a:fillRect/>
-                    </a:stretch>
-                  </pic:blipFill>
-                  <pic:spPr bwMode="auto">
-                    <a:xfrm>
-                      <a:off x="0" y="0"/>
-                      <a:ext cx="1428750" cy="1428750"/>
-                    </a:xfrm>
-                    <a:prstGeom prst="rect">
-                      <a:avLst/>
-                    </a:prstGeom>
-                    <a:noFill/>
-                    <a:ln>
-                      <a:noFill/>
-                    </a:ln>
-                  </pic:spPr>
-                </pic:pic>
-              </a:graphicData>
-            </a:graphic>
-          </wp:inline>
-        </w:drawing>
       </w:r>
       <w:proofErr w:type="gramStart"/>
       <w:r>
@@ -1305,7 +1257,7 @@
         <w:rPr>
           <w:rFonts w:ascii="Times New Roman" w:hAnsi="Times New Roman" w:cs="Times New Roman"/>
         </w:rPr>
-        <w:t xml:space="preserve">A. Text1</w:t>
+        <w:t xml:space="preserve">A. You are stupid</w:t>
       </w:r>
       <w:proofErr w:type="gramEnd"/>
       <w:r>
@@ -1341,7 +1293,7 @@
         <w:rPr>
           <w:rFonts w:ascii="Times New Roman" w:hAnsi="Times New Roman" w:cs="Times New Roman"/>
         </w:rPr>
-        <w:t xml:space="preserve">B. Text1</w:t>
+        <w:t xml:space="preserve">B. yes you are</w:t>
       </w:r>
       <w:proofErr w:type="gramEnd"/>
       <w:r>
@@ -1377,7 +1329,7 @@
         <w:rPr>
           <w:rFonts w:ascii="Times New Roman" w:hAnsi="Times New Roman" w:cs="Times New Roman"/>
         </w:rPr>
-        <w:t xml:space="preserve">C. Text1</w:t>
+        <w:t xml:space="preserve">C. Maybe you are genius</w:t>
       </w:r>
       <w:proofErr w:type="gramEnd"/>
       <w:r>
@@ -1413,7 +1365,676 @@
         <w:rPr>
           <w:rFonts w:ascii="Times New Roman" w:hAnsi="Times New Roman" w:cs="Times New Roman"/>
         </w:rPr>
-        <w:t xml:space="preserve">D. Text1</w:t>
+        <w:t xml:space="preserve">D. No you are not</w:t>
+      </w:r>
+    </w:p>
+    <w:p>
+      <w:pPr>
+        <w:spacing w:after="0" w:line="240" w:lineRule="auto"/>
+        <w:jc w:val="both"/>
+        <w:rPr>
+          <w:rFonts w:ascii="Times New Roman" w:hAnsi="Times New Roman" w:cs="Times New Roman"/>
+        </w:rPr>
+      </w:pPr>
+      <w:r>
+        <w:rPr>
+          <w:rFonts w:ascii="Times New Roman" w:hAnsi="Times New Roman" w:cs="Times New Roman"/>
+        </w:rPr>
+        <w:t xml:space="preserve"> </w:t>
+      </w:r>
+    </w:p>
+    <w:p>
+      <w:pPr>
+        <w:spacing w:after="0" w:line="240" w:lineRule="auto"/>
+        <w:jc w:val="both"/>
+        <w:rPr>
+          <w:rStyle w:val="markedcontent"/>
+          <w:rFonts w:ascii="Times New Roman" w:hAnsi="Times New Roman" w:cs="Times New Roman"/>
+        </w:rPr>
+      </w:pPr>
+      <w:r>
+        <w:rPr>
+          <w:rStyle w:val="markedcontent"/>
+          <w:rFonts w:ascii="Times New Roman" w:hAnsi="Times New Roman" w:cs="Times New Roman"/>
+          <w:b/>
+          <w:bCs/>
+        </w:rPr>
+        <w:t xml:space="preserve">2</w:t>
+      </w:r>
+      <w:r>
+        <w:rPr>
+          <w:rStyle w:val="markedcontent"/>
+          <w:rFonts w:ascii="Times New Roman" w:hAnsi="Times New Roman" w:cs="Times New Roman"/>
+          <w:b/>
+          <w:bCs/>
+        </w:rPr>
+        <w:t xml:space="preserve">.</w:t>
+      </w:r>
+      <w:r>
+        <w:rPr>
+          <w:rStyle w:val="markedcontent"/>
+          <w:rFonts w:ascii="Times New Roman" w:hAnsi="Times New Roman" w:cs="Times New Roman"/>
+        </w:rPr>
+        <w:t xml:space="preserve"> Test question</w:t>
+      </w:r>
+    </w:p>
+    <w:p>
+      <w:pPr>
+        <w:spacing w:after="0" w:line="240" w:lineRule="auto"/>
+        <w:jc w:val="both"/>
+        <w:rPr>
+          <w:rFonts w:ascii="Times New Roman" w:hAnsi="Times New Roman" w:cs="Times New Roman"/>
+        </w:rPr>
+      </w:pPr>
+      <w:r>
+        <w:rPr>
+          <w:rStyle w:val="markedcontent"/>
+          <w:rFonts w:ascii="Times New Roman" w:hAnsi="Times New Roman" w:cs="Times New Roman"/>
+        </w:rPr>
+      </w:r>
+      <w:proofErr w:type="gramStart"/>
+      <w:r>
+        <w:rPr>
+          <w:rStyle w:val="markedcontent"/>
+          <w:rFonts w:ascii="Times New Roman" w:hAnsi="Times New Roman" w:cs="Times New Roman"/>
+        </w:rPr>
+        <w:t/>
+      </w:r>
+      <w:r>
+        <w:rPr>
+          <w:rFonts w:ascii="Times New Roman" w:hAnsi="Times New Roman" w:cs="Times New Roman"/>
+        </w:rPr>
+        <w:t/>
+      </w:r>
+      <w:proofErr w:type="gramEnd"/>
+      <w:r>
+        <w:rPr>
+          <w:rStyle w:val="hljs-selector-id"/>
+          <w:rFonts w:ascii="Times New Roman" w:hAnsi="Times New Roman" w:cs="Times New Roman"/>
+        </w:rPr>
+        <w:t/>
+      </w:r>
+      <w:r>
+        <w:rPr>
+          <w:rFonts w:ascii="Times New Roman" w:hAnsi="Times New Roman" w:cs="Times New Roman"/>
+        </w:rPr>
+        <w:t/>
+      </w:r>
+    </w:p>
+    <w:p>
+      <w:pPr>
+        <w:spacing w:after="0" w:line="240" w:lineRule="auto"/>
+        <w:jc w:val="both"/>
+        <w:rPr>
+          <w:rFonts w:ascii="Times New Roman" w:hAnsi="Times New Roman" w:cs="Times New Roman"/>
+          <w:lang w:val="en-US"/>
+        </w:rPr>
+      </w:pPr>
+      <w:r>
+        <w:rPr>
+          <w:rFonts w:ascii="Times New Roman" w:hAnsi="Times New Roman" w:cs="Times New Roman"/>
+        </w:rPr>
+        <w:t xml:space="preserve">    </w:t>
+      </w:r>
+      <w:r>
+        <w:rPr>
+          <w:rFonts w:ascii="Times New Roman" w:hAnsi="Times New Roman" w:cs="Times New Roman"/>
+        </w:rPr>
+        <w:t xml:space="preserve">A. a</w:t>
+      </w:r>
+      <w:proofErr w:type="gramEnd"/>
+      <w:r>
+        <w:rPr>
+          <w:rStyle w:val="hljs-selector-id"/>
+          <w:rFonts w:ascii="Times New Roman" w:hAnsi="Times New Roman" w:cs="Times New Roman"/>
+        </w:rPr>
+        <w:t/>
+      </w:r>
+      <w:r>
+        <w:rPr>
+          <w:rFonts w:ascii="Times New Roman" w:hAnsi="Times New Roman" w:cs="Times New Roman"/>
+        </w:rPr>
+        <w:t/>
+      </w:r>
+    </w:p>
+    <w:p>
+      <w:pPr>
+        <w:spacing w:after="0" w:line="240" w:lineRule="auto"/>
+        <w:jc w:val="both"/>
+        <w:rPr>
+          <w:rFonts w:ascii="Times New Roman" w:hAnsi="Times New Roman" w:cs="Times New Roman"/>
+          <w:lang w:val="en-US"/>
+        </w:rPr>
+      </w:pPr>
+      <w:r>
+        <w:rPr>
+          <w:rFonts w:ascii="Times New Roman" w:hAnsi="Times New Roman" w:cs="Times New Roman"/>
+        </w:rPr>
+        <w:t xml:space="preserve">    </w:t>
+      </w:r>
+      <w:r>
+        <w:rPr>
+          <w:rFonts w:ascii="Times New Roman" w:hAnsi="Times New Roman" w:cs="Times New Roman"/>
+        </w:rPr>
+        <w:t xml:space="preserve">B. b</w:t>
+      </w:r>
+      <w:proofErr w:type="gramEnd"/>
+      <w:r>
+        <w:rPr>
+          <w:rStyle w:val="hljs-selector-id"/>
+          <w:rFonts w:ascii="Times New Roman" w:hAnsi="Times New Roman" w:cs="Times New Roman"/>
+        </w:rPr>
+        <w:t/>
+      </w:r>
+      <w:r>
+        <w:rPr>
+          <w:rFonts w:ascii="Times New Roman" w:hAnsi="Times New Roman" w:cs="Times New Roman"/>
+        </w:rPr>
+        <w:t/>
+      </w:r>
+    </w:p>
+    <w:p>
+      <w:pPr>
+        <w:spacing w:after="0" w:line="240" w:lineRule="auto"/>
+        <w:jc w:val="both"/>
+        <w:rPr>
+          <w:rFonts w:ascii="Times New Roman" w:hAnsi="Times New Roman" w:cs="Times New Roman"/>
+          <w:lang w:val="en-US"/>
+        </w:rPr>
+      </w:pPr>
+      <w:r>
+        <w:rPr>
+          <w:rFonts w:ascii="Times New Roman" w:hAnsi="Times New Roman" w:cs="Times New Roman"/>
+        </w:rPr>
+        <w:t xml:space="preserve">    </w:t>
+      </w:r>
+      <w:r>
+        <w:rPr>
+          <w:rFonts w:ascii="Times New Roman" w:hAnsi="Times New Roman" w:cs="Times New Roman"/>
+        </w:rPr>
+        <w:t xml:space="preserve">C. n</w:t>
+      </w:r>
+      <w:proofErr w:type="gramEnd"/>
+      <w:r>
+        <w:rPr>
+          <w:rStyle w:val="hljs-selector-id"/>
+          <w:rFonts w:ascii="Times New Roman" w:hAnsi="Times New Roman" w:cs="Times New Roman"/>
+        </w:rPr>
+        <w:t/>
+      </w:r>
+      <w:r>
+        <w:rPr>
+          <w:rFonts w:ascii="Times New Roman" w:hAnsi="Times New Roman" w:cs="Times New Roman"/>
+        </w:rPr>
+        <w:t/>
+      </w:r>
+    </w:p>
+    <w:p>
+      <w:pPr>
+        <w:spacing w:after="0" w:line="240" w:lineRule="auto"/>
+        <w:jc w:val="both"/>
+        <w:rPr>
+          <w:rFonts w:ascii="Times New Roman" w:hAnsi="Times New Roman" w:cs="Times New Roman"/>
+          <w:lang w:val="en-US"/>
+        </w:rPr>
+      </w:pPr>
+      <w:r>
+        <w:rPr>
+          <w:rFonts w:ascii="Times New Roman" w:hAnsi="Times New Roman" w:cs="Times New Roman"/>
+        </w:rPr>
+        <w:t xml:space="preserve">    </w:t>
+      </w:r>
+      <w:r>
+        <w:rPr>
+          <w:rFonts w:ascii="Times New Roman" w:hAnsi="Times New Roman" w:cs="Times New Roman"/>
+        </w:rPr>
+        <w:t xml:space="preserve">D. j</w:t>
+      </w:r>
+    </w:p>
+    <w:p>
+      <w:pPr>
+        <w:spacing w:after="0" w:line="240" w:lineRule="auto"/>
+        <w:jc w:val="both"/>
+        <w:rPr>
+          <w:rFonts w:ascii="Times New Roman" w:hAnsi="Times New Roman" w:cs="Times New Roman"/>
+        </w:rPr>
+      </w:pPr>
+      <w:r>
+        <w:rPr>
+          <w:rFonts w:ascii="Times New Roman" w:hAnsi="Times New Roman" w:cs="Times New Roman"/>
+        </w:rPr>
+        <w:t xml:space="preserve"> </w:t>
+      </w:r>
+    </w:p>
+    <w:p>
+      <w:pPr>
+        <w:spacing w:after="0" w:line="240" w:lineRule="auto"/>
+        <w:jc w:val="both"/>
+        <w:rPr>
+          <w:rStyle w:val="markedcontent"/>
+          <w:rFonts w:ascii="Times New Roman" w:hAnsi="Times New Roman" w:cs="Times New Roman"/>
+        </w:rPr>
+      </w:pPr>
+      <w:r>
+        <w:rPr>
+          <w:rStyle w:val="markedcontent"/>
+          <w:rFonts w:ascii="Times New Roman" w:hAnsi="Times New Roman" w:cs="Times New Roman"/>
+          <w:b/>
+          <w:bCs/>
+        </w:rPr>
+        <w:t xml:space="preserve">3</w:t>
+      </w:r>
+      <w:r>
+        <w:rPr>
+          <w:rStyle w:val="markedcontent"/>
+          <w:rFonts w:ascii="Times New Roman" w:hAnsi="Times New Roman" w:cs="Times New Roman"/>
+          <w:b/>
+          <w:bCs/>
+        </w:rPr>
+        <w:t xml:space="preserve">.</w:t>
+      </w:r>
+      <w:r>
+        <w:rPr>
+          <w:rStyle w:val="markedcontent"/>
+          <w:rFonts w:ascii="Times New Roman" w:hAnsi="Times New Roman" w:cs="Times New Roman"/>
+        </w:rPr>
+        <w:t xml:space="preserve"> cccjjk</w:t>
+      </w:r>
+    </w:p>
+    <w:p>
+      <w:pPr>
+        <w:spacing w:after="0" w:line="240" w:lineRule="auto"/>
+        <w:jc w:val="both"/>
+        <w:rPr>
+          <w:rFonts w:ascii="Times New Roman" w:hAnsi="Times New Roman" w:cs="Times New Roman"/>
+        </w:rPr>
+      </w:pPr>
+      <w:r>
+        <w:rPr>
+          <w:rStyle w:val="markedcontent"/>
+          <w:rFonts w:ascii="Times New Roman" w:hAnsi="Times New Roman" w:cs="Times New Roman"/>
+        </w:rPr>
+      </w:r>
+      <w:proofErr w:type="gramStart"/>
+      <w:r>
+        <w:rPr>
+          <w:rStyle w:val="markedcontent"/>
+          <w:rFonts w:ascii="Times New Roman" w:hAnsi="Times New Roman" w:cs="Times New Roman"/>
+        </w:rPr>
+        <w:t/>
+      </w:r>
+      <w:r>
+        <w:rPr>
+          <w:rFonts w:ascii="Times New Roman" w:hAnsi="Times New Roman" w:cs="Times New Roman"/>
+        </w:rPr>
+        <w:t/>
+      </w:r>
+      <w:proofErr w:type="gramEnd"/>
+      <w:r>
+        <w:rPr>
+          <w:rStyle w:val="hljs-selector-id"/>
+          <w:rFonts w:ascii="Times New Roman" w:hAnsi="Times New Roman" w:cs="Times New Roman"/>
+        </w:rPr>
+        <w:t/>
+      </w:r>
+      <w:r>
+        <w:rPr>
+          <w:rFonts w:ascii="Times New Roman" w:hAnsi="Times New Roman" w:cs="Times New Roman"/>
+        </w:rPr>
+        <w:t/>
+      </w:r>
+    </w:p>
+    <w:p>
+      <w:pPr>
+        <w:spacing w:after="0" w:line="240" w:lineRule="auto"/>
+        <w:jc w:val="both"/>
+        <w:rPr>
+          <w:rFonts w:ascii="Times New Roman" w:hAnsi="Times New Roman" w:cs="Times New Roman"/>
+          <w:lang w:val="en-US"/>
+        </w:rPr>
+      </w:pPr>
+      <w:r>
+        <w:rPr>
+          <w:rFonts w:ascii="Times New Roman" w:hAnsi="Times New Roman" w:cs="Times New Roman"/>
+        </w:rPr>
+        <w:t xml:space="preserve">    </w:t>
+      </w:r>
+      <w:r>
+        <w:rPr>
+          <w:rFonts w:ascii="Times New Roman" w:hAnsi="Times New Roman" w:cs="Times New Roman"/>
+        </w:rPr>
+        <w:t xml:space="preserve">A. j</w:t>
+      </w:r>
+      <w:proofErr w:type="gramEnd"/>
+      <w:r>
+        <w:rPr>
+          <w:rStyle w:val="hljs-selector-id"/>
+          <w:rFonts w:ascii="Times New Roman" w:hAnsi="Times New Roman" w:cs="Times New Roman"/>
+        </w:rPr>
+        <w:t/>
+      </w:r>
+      <w:r>
+        <w:rPr>
+          <w:rFonts w:ascii="Times New Roman" w:hAnsi="Times New Roman" w:cs="Times New Roman"/>
+        </w:rPr>
+        <w:t/>
+      </w:r>
+    </w:p>
+    <w:p>
+      <w:pPr>
+        <w:spacing w:after="0" w:line="240" w:lineRule="auto"/>
+        <w:jc w:val="both"/>
+        <w:rPr>
+          <w:rFonts w:ascii="Times New Roman" w:hAnsi="Times New Roman" w:cs="Times New Roman"/>
+          <w:lang w:val="en-US"/>
+        </w:rPr>
+      </w:pPr>
+      <w:r>
+        <w:rPr>
+          <w:rFonts w:ascii="Times New Roman" w:hAnsi="Times New Roman" w:cs="Times New Roman"/>
+        </w:rPr>
+        <w:t xml:space="preserve">    </w:t>
+      </w:r>
+      <w:r>
+        <w:rPr>
+          <w:rFonts w:ascii="Times New Roman" w:hAnsi="Times New Roman" w:cs="Times New Roman"/>
+        </w:rPr>
+        <w:t xml:space="preserve">B. j</w:t>
+      </w:r>
+      <w:proofErr w:type="gramEnd"/>
+      <w:r>
+        <w:rPr>
+          <w:rStyle w:val="hljs-selector-id"/>
+          <w:rFonts w:ascii="Times New Roman" w:hAnsi="Times New Roman" w:cs="Times New Roman"/>
+        </w:rPr>
+        <w:t/>
+      </w:r>
+      <w:r>
+        <w:rPr>
+          <w:rFonts w:ascii="Times New Roman" w:hAnsi="Times New Roman" w:cs="Times New Roman"/>
+        </w:rPr>
+        <w:t/>
+      </w:r>
+    </w:p>
+    <w:p>
+      <w:pPr>
+        <w:spacing w:after="0" w:line="240" w:lineRule="auto"/>
+        <w:jc w:val="both"/>
+        <w:rPr>
+          <w:rFonts w:ascii="Times New Roman" w:hAnsi="Times New Roman" w:cs="Times New Roman"/>
+          <w:lang w:val="en-US"/>
+        </w:rPr>
+      </w:pPr>
+      <w:r>
+        <w:rPr>
+          <w:rFonts w:ascii="Times New Roman" w:hAnsi="Times New Roman" w:cs="Times New Roman"/>
+        </w:rPr>
+        <w:t xml:space="preserve">    </w:t>
+      </w:r>
+      <w:r>
+        <w:rPr>
+          <w:rFonts w:ascii="Times New Roman" w:hAnsi="Times New Roman" w:cs="Times New Roman"/>
+        </w:rPr>
+        <w:t xml:space="preserve">C. j</w:t>
+      </w:r>
+      <w:proofErr w:type="gramEnd"/>
+      <w:r>
+        <w:rPr>
+          <w:rStyle w:val="hljs-selector-id"/>
+          <w:rFonts w:ascii="Times New Roman" w:hAnsi="Times New Roman" w:cs="Times New Roman"/>
+        </w:rPr>
+        <w:t/>
+      </w:r>
+      <w:r>
+        <w:rPr>
+          <w:rFonts w:ascii="Times New Roman" w:hAnsi="Times New Roman" w:cs="Times New Roman"/>
+        </w:rPr>
+        <w:t/>
+      </w:r>
+    </w:p>
+    <w:p>
+      <w:pPr>
+        <w:spacing w:after="0" w:line="240" w:lineRule="auto"/>
+        <w:jc w:val="both"/>
+        <w:rPr>
+          <w:rFonts w:ascii="Times New Roman" w:hAnsi="Times New Roman" w:cs="Times New Roman"/>
+          <w:lang w:val="en-US"/>
+        </w:rPr>
+      </w:pPr>
+      <w:r>
+        <w:rPr>
+          <w:rFonts w:ascii="Times New Roman" w:hAnsi="Times New Roman" w:cs="Times New Roman"/>
+        </w:rPr>
+        <w:t xml:space="preserve">    </w:t>
+      </w:r>
+      <w:r>
+        <w:rPr>
+          <w:rFonts w:ascii="Times New Roman" w:hAnsi="Times New Roman" w:cs="Times New Roman"/>
+        </w:rPr>
+        <w:t xml:space="preserve">D. j</w:t>
+      </w:r>
+    </w:p>
+    <w:p>
+      <w:pPr>
+        <w:spacing w:after="0" w:line="240" w:lineRule="auto"/>
+        <w:jc w:val="both"/>
+        <w:rPr>
+          <w:rFonts w:ascii="Times New Roman" w:hAnsi="Times New Roman" w:cs="Times New Roman"/>
+        </w:rPr>
+      </w:pPr>
+      <w:r>
+        <w:rPr>
+          <w:rFonts w:ascii="Times New Roman" w:hAnsi="Times New Roman" w:cs="Times New Roman"/>
+        </w:rPr>
+        <w:t xml:space="preserve"> </w:t>
+      </w:r>
+    </w:p>
+    <w:p>
+      <w:pPr>
+        <w:spacing w:after="0" w:line="240" w:lineRule="auto"/>
+        <w:jc w:val="both"/>
+        <w:rPr>
+          <w:rStyle w:val="markedcontent"/>
+          <w:rFonts w:ascii="Times New Roman" w:hAnsi="Times New Roman" w:cs="Times New Roman"/>
+        </w:rPr>
+      </w:pPr>
+      <w:r>
+        <w:rPr>
+          <w:rStyle w:val="markedcontent"/>
+          <w:rFonts w:ascii="Times New Roman" w:hAnsi="Times New Roman" w:cs="Times New Roman"/>
+          <w:b/>
+          <w:bCs/>
+        </w:rPr>
+        <w:t xml:space="preserve">4</w:t>
+      </w:r>
+      <w:r>
+        <w:rPr>
+          <w:rStyle w:val="markedcontent"/>
+          <w:rFonts w:ascii="Times New Roman" w:hAnsi="Times New Roman" w:cs="Times New Roman"/>
+          <w:b/>
+          <w:bCs/>
+        </w:rPr>
+        <w:t xml:space="preserve">.</w:t>
+      </w:r>
+      <w:r>
+        <w:rPr>
+          <w:rStyle w:val="markedcontent"/>
+          <w:rFonts w:ascii="Times New Roman" w:hAnsi="Times New Roman" w:cs="Times New Roman"/>
+        </w:rPr>
+        <w:t xml:space="preserve"> hastla</w:t>
+      </w:r>
+    </w:p>
+    <w:p>
+      <w:pPr>
+        <w:spacing w:after="0" w:line="240" w:lineRule="auto"/>
+        <w:jc w:val="both"/>
+        <w:rPr>
+          <w:rFonts w:ascii="Times New Roman" w:hAnsi="Times New Roman" w:cs="Times New Roman"/>
+        </w:rPr>
+      </w:pPr>
+      <w:r>
+        <w:rPr>
+          <w:rStyle w:val="markedcontent"/>
+          <w:rFonts w:ascii="Times New Roman" w:hAnsi="Times New Roman" w:cs="Times New Roman"/>
+        </w:rPr>
+      </w:r>
+      <w:proofErr w:type="gramStart"/>
+      <w:r>
+        <w:rPr>
+          <w:rStyle w:val="markedcontent"/>
+          <w:rFonts w:ascii="Times New Roman" w:hAnsi="Times New Roman" w:cs="Times New Roman"/>
+        </w:rPr>
+        <w:t/>
+      </w:r>
+      <w:r>
+        <w:rPr>
+          <w:rFonts w:ascii="Times New Roman" w:hAnsi="Times New Roman" w:cs="Times New Roman"/>
+        </w:rPr>
+        <w:t/>
+      </w:r>
+      <w:proofErr w:type="gramEnd"/>
+      <w:r>
+        <w:rPr>
+          <w:rStyle w:val="hljs-selector-id"/>
+          <w:rFonts w:ascii="Times New Roman" w:hAnsi="Times New Roman" w:cs="Times New Roman"/>
+        </w:rPr>
+        <w:t/>
+      </w:r>
+      <w:r>
+        <w:rPr>
+          <w:rFonts w:ascii="Times New Roman" w:hAnsi="Times New Roman" w:cs="Times New Roman"/>
+        </w:rPr>
+        <w:t/>
+      </w:r>
+    </w:p>
+    <w:p>
+      <w:pPr>
+        <w:spacing w:after="0" w:line="240" w:lineRule="auto"/>
+        <w:jc w:val="both"/>
+        <w:rPr>
+          <w:rFonts w:ascii="Times New Roman" w:hAnsi="Times New Roman" w:cs="Times New Roman"/>
+          <w:lang w:val="en-US"/>
+        </w:rPr>
+      </w:pPr>
+      <w:r>
+        <w:rPr>
+          <w:rFonts w:ascii="Times New Roman" w:hAnsi="Times New Roman" w:cs="Times New Roman"/>
+        </w:rPr>
+        <w:t xml:space="preserve">    </w:t>
+      </w:r>
+      <w:r>
+        <w:rPr>
+          <w:rFonts w:ascii="Times New Roman" w:hAnsi="Times New Roman" w:cs="Times New Roman"/>
+        </w:rPr>
+        <w:t xml:space="preserve">A. h</w:t>
+      </w:r>
+      <w:proofErr w:type="gramEnd"/>
+      <w:r>
+        <w:rPr>
+          <w:rStyle w:val="hljs-selector-id"/>
+          <w:rFonts w:ascii="Times New Roman" w:hAnsi="Times New Roman" w:cs="Times New Roman"/>
+        </w:rPr>
+        <w:t/>
+      </w:r>
+      <w:r>
+        <w:rPr>
+          <w:rFonts w:ascii="Times New Roman" w:hAnsi="Times New Roman" w:cs="Times New Roman"/>
+        </w:rPr>
+        <w:t/>
+      </w:r>
+    </w:p>
+    <w:p>
+      <w:pPr>
+        <w:spacing w:after="0" w:line="240" w:lineRule="auto"/>
+        <w:jc w:val="both"/>
+        <w:rPr>
+          <w:rFonts w:ascii="Times New Roman" w:hAnsi="Times New Roman" w:cs="Times New Roman"/>
+          <w:lang w:val="en-US"/>
+        </w:rPr>
+      </w:pPr>
+      <w:r>
+        <w:rPr>
+          <w:rFonts w:ascii="Times New Roman" w:hAnsi="Times New Roman" w:cs="Times New Roman"/>
+        </w:rPr>
+        <w:t xml:space="preserve">    </w:t>
+      </w:r>
+      <w:r>
+        <w:rPr>
+          <w:rFonts w:ascii="Times New Roman" w:hAnsi="Times New Roman" w:cs="Times New Roman"/>
+        </w:rPr>
+        <w:t xml:space="preserve">B. j</w:t>
+      </w:r>
+      <w:proofErr w:type="gramEnd"/>
+      <w:r>
+        <w:rPr>
+          <w:rStyle w:val="hljs-selector-id"/>
+          <w:rFonts w:ascii="Times New Roman" w:hAnsi="Times New Roman" w:cs="Times New Roman"/>
+        </w:rPr>
+        <w:t/>
+      </w:r>
+      <w:r>
+        <w:rPr>
+          <w:rFonts w:ascii="Times New Roman" w:hAnsi="Times New Roman" w:cs="Times New Roman"/>
+        </w:rPr>
+        <w:t/>
+      </w:r>
+    </w:p>
+    <w:p>
+      <w:pPr>
+        <w:spacing w:after="0" w:line="240" w:lineRule="auto"/>
+        <w:jc w:val="both"/>
+        <w:rPr>
+          <w:rFonts w:ascii="Times New Roman" w:hAnsi="Times New Roman" w:cs="Times New Roman"/>
+          <w:lang w:val="en-US"/>
+        </w:rPr>
+      </w:pPr>
+      <w:r>
+        <w:rPr>
+          <w:rFonts w:ascii="Times New Roman" w:hAnsi="Times New Roman" w:cs="Times New Roman"/>
+        </w:rPr>
+        <w:t xml:space="preserve">    </w:t>
+      </w:r>
+      <w:r>
+        <w:rPr>
+          <w:rFonts w:ascii="Times New Roman" w:hAnsi="Times New Roman" w:cs="Times New Roman"/>
+        </w:rPr>
+        <w:t xml:space="preserve">C. j</w:t>
+      </w:r>
+      <w:proofErr w:type="gramEnd"/>
+      <w:r>
+        <w:rPr>
+          <w:rStyle w:val="hljs-selector-id"/>
+          <w:rFonts w:ascii="Times New Roman" w:hAnsi="Times New Roman" w:cs="Times New Roman"/>
+        </w:rPr>
+        <w:t/>
+      </w:r>
+      <w:r>
+        <w:rPr>
+          <w:rFonts w:ascii="Times New Roman" w:hAnsi="Times New Roman" w:cs="Times New Roman"/>
+        </w:rPr>
+        <w:t/>
+      </w:r>
+    </w:p>
+    <w:p>
+      <w:pPr>
+        <w:spacing w:after="0" w:line="240" w:lineRule="auto"/>
+        <w:jc w:val="both"/>
+        <w:rPr>
+          <w:rFonts w:ascii="Times New Roman" w:hAnsi="Times New Roman" w:cs="Times New Roman"/>
+          <w:lang w:val="en-US"/>
+        </w:rPr>
+      </w:pPr>
+      <w:r>
+        <w:rPr>
+          <w:rFonts w:ascii="Times New Roman" w:hAnsi="Times New Roman" w:cs="Times New Roman"/>
+        </w:rPr>
+        <w:t xml:space="preserve">    </w:t>
+      </w:r>
+      <w:r>
+        <w:rPr>
+          <w:rFonts w:ascii="Times New Roman" w:hAnsi="Times New Roman" w:cs="Times New Roman"/>
+        </w:rPr>
+        <w:t xml:space="preserve">D. j</w:t>
       </w:r>
     </w:p>
     <w:p>

</xml_diff>